<commit_message>
Cite Zenodo archive of v1.0.0
</commit_message>
<xml_diff>
--- a/paper/paper.docx
+++ b/paper/paper.docx
@@ -12361,8 +12361,8 @@
     </w:p>
     <w:bookmarkEnd w:id="63"/>
     <w:bookmarkEnd w:id="64"/>
-    <w:bookmarkStart w:id="71" w:name="decl"/>
-    <w:bookmarkStart w:id="70" w:name="declarations"/>
+    <w:bookmarkStart w:id="72" w:name="decl"/>
+    <w:bookmarkStart w:id="71" w:name="declarations"/>
     <w:p>
       <w:pPr>
         <w:pStyle w:val="Heading1"/>
@@ -12371,7 +12371,7 @@
         <w:t xml:space="preserve">Declarations</w:t>
       </w:r>
     </w:p>
-    <w:bookmarkStart w:id="66" w:name="data-and-code-availability"/>
+    <w:bookmarkStart w:id="67" w:name="data-and-code-availability"/>
     <w:p>
       <w:pPr>
         <w:pStyle w:val="Heading2"/>
@@ -12399,7 +12399,18 @@
         </w:r>
       </w:hyperlink>
       <w:r>
-        <w:t xml:space="preserve">. Closed-loop simulations ran at commit</w:t>
+        <w:t xml:space="preserve">, archived on Zenodo as release v1.0.0 (doi:</w:t>
+      </w:r>
+      <w:hyperlink r:id="rId66">
+        <w:r>
+          <w:rPr>
+            <w:rStyle w:val="Hyperlink"/>
+          </w:rPr>
+          <w:t xml:space="preserve">10.5281/zenodo.23156035</w:t>
+        </w:r>
+      </w:hyperlink>
+      <w:r>
+        <w:t xml:space="preserve">). Closed-loop simulations ran at commit</w:t>
       </w:r>
       <w:r>
         <w:t xml:space="preserve"> </w:t>
@@ -12505,8 +12516,8 @@
         <w:t xml:space="preserve">.</w:t>
       </w:r>
     </w:p>
-    <w:bookmarkEnd w:id="66"/>
-    <w:bookmarkStart w:id="67" w:name="acknowledgements-and-licences"/>
+    <w:bookmarkEnd w:id="67"/>
+    <w:bookmarkStart w:id="68" w:name="acknowledgements-and-licences"/>
     <w:p>
       <w:pPr>
         <w:pStyle w:val="Heading2"/>
@@ -12597,8 +12608,8 @@
         <w:t xml:space="preserve">.</w:t>
       </w:r>
     </w:p>
-    <w:bookmarkEnd w:id="67"/>
-    <w:bookmarkStart w:id="68" w:name="ai-assistance"/>
+    <w:bookmarkEnd w:id="68"/>
+    <w:bookmarkStart w:id="69" w:name="ai-assistance"/>
     <w:p>
       <w:pPr>
         <w:pStyle w:val="Heading2"/>
@@ -12615,8 +12626,8 @@
         <w:t xml:space="preserve">AI tools (Anthropic Claude) assisted with code, analysis, reviews and drafting. The author directed the study, made the design decisions and checked the results.</w:t>
       </w:r>
     </w:p>
-    <w:bookmarkEnd w:id="68"/>
-    <w:bookmarkStart w:id="69" w:name="competing-interests"/>
+    <w:bookmarkEnd w:id="69"/>
+    <w:bookmarkStart w:id="70" w:name="competing-interests"/>
     <w:p>
       <w:pPr>
         <w:pStyle w:val="Heading2"/>
@@ -12633,11 +12644,11 @@
         <w:t xml:space="preserve">The author declares no competing interests.</w:t>
       </w:r>
     </w:p>
-    <w:bookmarkEnd w:id="69"/>
     <w:bookmarkEnd w:id="70"/>
     <w:bookmarkEnd w:id="71"/>
-    <w:bookmarkStart w:id="117" w:name="refs"/>
-    <w:bookmarkStart w:id="116" w:name="references"/>
+    <w:bookmarkEnd w:id="72"/>
+    <w:bookmarkStart w:id="118" w:name="refs"/>
+    <w:bookmarkStart w:id="117" w:name="references"/>
     <w:p>
       <w:pPr>
         <w:pStyle w:val="Heading1"/>
@@ -12654,7 +12665,7 @@
           <w:numId w:val="1001"/>
         </w:numPr>
       </w:pPr>
-      <w:bookmarkStart w:id="73" w:name="ref-1"/>
+      <w:bookmarkStart w:id="74" w:name="ref-1"/>
       <w:r>
         <w:t xml:space="preserve">Dorkenwald S, et al. (2024). Neuronal wiring diagram of an adult brain.</w:t>
       </w:r>
@@ -12677,7 +12688,7 @@
       <w:r>
         <w:t xml:space="preserve"> </w:t>
       </w:r>
-      <w:hyperlink r:id="rId72">
+      <w:hyperlink r:id="rId73">
         <w:r>
           <w:rPr>
             <w:rStyle w:val="Hyperlink"/>
@@ -12685,7 +12696,7 @@
           <w:t xml:space="preserve">doi:10.1038/s41586-024-07558-y</w:t>
         </w:r>
       </w:hyperlink>
-      <w:bookmarkEnd w:id="73"/>
+      <w:bookmarkEnd w:id="74"/>
     </w:p>
     <w:p>
       <w:pPr>
@@ -12695,7 +12706,7 @@
           <w:numId w:val="1001"/>
         </w:numPr>
       </w:pPr>
-      <w:bookmarkStart w:id="75" w:name="ref-2"/>
+      <w:bookmarkStart w:id="76" w:name="ref-2"/>
       <w:r>
         <w:t xml:space="preserve">Schlegel P, et al. (2024). Whole-brain annotation and multi-connectome cell typing of</w:t>
       </w:r>
@@ -12731,7 +12742,7 @@
       <w:r>
         <w:t xml:space="preserve"> </w:t>
       </w:r>
-      <w:hyperlink r:id="rId74">
+      <w:hyperlink r:id="rId75">
         <w:r>
           <w:rPr>
             <w:rStyle w:val="Hyperlink"/>
@@ -12739,7 +12750,7 @@
           <w:t xml:space="preserve">doi:10.1038/s41586-024-07686-5</w:t>
         </w:r>
       </w:hyperlink>
-      <w:bookmarkEnd w:id="75"/>
+      <w:bookmarkEnd w:id="76"/>
     </w:p>
     <w:p>
       <w:pPr>
@@ -12749,7 +12760,7 @@
           <w:numId w:val="1001"/>
         </w:numPr>
       </w:pPr>
-      <w:bookmarkStart w:id="77" w:name="ref-3"/>
+      <w:bookmarkStart w:id="78" w:name="ref-3"/>
       <w:r>
         <w:t xml:space="preserve">Shiu PK, et al. (2024). A</w:t>
       </w:r>
@@ -12788,7 +12799,7 @@
       <w:r>
         <w:t xml:space="preserve"> </w:t>
       </w:r>
-      <w:hyperlink r:id="rId76">
+      <w:hyperlink r:id="rId77">
         <w:r>
           <w:rPr>
             <w:rStyle w:val="Hyperlink"/>
@@ -12796,7 +12807,7 @@
           <w:t xml:space="preserve">doi:10.1038/s41586-024-07763-9</w:t>
         </w:r>
       </w:hyperlink>
-      <w:bookmarkEnd w:id="77"/>
+      <w:bookmarkEnd w:id="78"/>
     </w:p>
     <w:p>
       <w:pPr>
@@ -12806,7 +12817,7 @@
           <w:numId w:val="1001"/>
         </w:numPr>
       </w:pPr>
-      <w:bookmarkStart w:id="78" w:name="ref-4"/>
+      <w:bookmarkStart w:id="79" w:name="ref-4"/>
       <w:r>
         <w:t xml:space="preserve">US Air Force (6 June 1975). MIL-F-9490D,</w:t>
       </w:r>
@@ -12823,7 +12834,7 @@
       <w:r>
         <w:t xml:space="preserve">, §3.1.3.6.1, Table III.</w:t>
       </w:r>
-      <w:bookmarkEnd w:id="78"/>
+      <w:bookmarkEnd w:id="79"/>
     </w:p>
     <w:p>
       <w:pPr>
@@ -12833,7 +12844,7 @@
           <w:numId w:val="1001"/>
         </w:numPr>
       </w:pPr>
-      <w:bookmarkStart w:id="80" w:name="ref-5"/>
+      <w:bookmarkStart w:id="81" w:name="ref-5"/>
       <w:r>
         <w:t xml:space="preserve">US Department of Defense (5 November 1980). MIL-F-8785C,</w:t>
       </w:r>
@@ -12853,7 +12864,7 @@
       <w:r>
         <w:t xml:space="preserve"> </w:t>
       </w:r>
-      <w:hyperlink r:id="rId79">
+      <w:hyperlink r:id="rId80">
         <w:r>
           <w:rPr>
             <w:rStyle w:val="Hyperlink"/>
@@ -12861,7 +12872,7 @@
           <w:t xml:space="preserve">everyspec.com/MIL-SPECS/MIL-SPECS-MIL-F/MIL-F-8785C_5295</w:t>
         </w:r>
       </w:hyperlink>
-      <w:bookmarkEnd w:id="80"/>
+      <w:bookmarkEnd w:id="81"/>
     </w:p>
     <w:p>
       <w:pPr>
@@ -12871,7 +12882,7 @@
           <w:numId w:val="1001"/>
         </w:numPr>
       </w:pPr>
-      <w:bookmarkStart w:id="82" w:name="ref-6"/>
+      <w:bookmarkStart w:id="83" w:name="ref-6"/>
       <w:r>
         <w:t xml:space="preserve">Maisak MS, et al. (2013). A directional tuning map of</w:t>
       </w:r>
@@ -12910,7 +12921,7 @@
       <w:r>
         <w:t xml:space="preserve"> </w:t>
       </w:r>
-      <w:hyperlink r:id="rId81">
+      <w:hyperlink r:id="rId82">
         <w:r>
           <w:rPr>
             <w:rStyle w:val="Hyperlink"/>
@@ -12918,7 +12929,7 @@
           <w:t xml:space="preserve">doi:10.1038/nature12320</w:t>
         </w:r>
       </w:hyperlink>
-      <w:bookmarkEnd w:id="82"/>
+      <w:bookmarkEnd w:id="83"/>
     </w:p>
     <w:p>
       <w:pPr>
@@ -12928,7 +12939,7 @@
           <w:numId w:val="1001"/>
         </w:numPr>
       </w:pPr>
-      <w:bookmarkStart w:id="84" w:name="ref-7"/>
+      <w:bookmarkStart w:id="85" w:name="ref-7"/>
       <w:r>
         <w:t xml:space="preserve">Shinomiya K, et al. (2019). Comparisons between the ON- and OFF-edge motion pathways in the</w:t>
       </w:r>
@@ -12967,7 +12978,7 @@
       <w:r>
         <w:t xml:space="preserve"> </w:t>
       </w:r>
-      <w:hyperlink r:id="rId83">
+      <w:hyperlink r:id="rId84">
         <w:r>
           <w:rPr>
             <w:rStyle w:val="Hyperlink"/>
@@ -12975,7 +12986,7 @@
           <w:t xml:space="preserve">PMC6338461</w:t>
         </w:r>
       </w:hyperlink>
-      <w:bookmarkEnd w:id="84"/>
+      <w:bookmarkEnd w:id="85"/>
     </w:p>
     <w:p>
       <w:pPr>
@@ -12985,7 +12996,7 @@
           <w:numId w:val="1001"/>
         </w:numPr>
       </w:pPr>
-      <w:bookmarkStart w:id="86" w:name="ref-8"/>
+      <w:bookmarkStart w:id="87" w:name="ref-8"/>
       <w:r>
         <w:t xml:space="preserve">Schnell B, et al. (2010). Processing of horizontal optic flow in three visual interneurons of the</w:t>
       </w:r>
@@ -13024,7 +13035,7 @@
       <w:r>
         <w:t xml:space="preserve"> </w:t>
       </w:r>
-      <w:hyperlink r:id="rId85">
+      <w:hyperlink r:id="rId86">
         <w:r>
           <w:rPr>
             <w:rStyle w:val="Hyperlink"/>
@@ -13032,7 +13043,7 @@
           <w:t xml:space="preserve">doi:10.1152/jn.00950.2009</w:t>
         </w:r>
       </w:hyperlink>
-      <w:bookmarkEnd w:id="86"/>
+      <w:bookmarkEnd w:id="87"/>
     </w:p>
     <w:p>
       <w:pPr>
@@ -13042,7 +13053,7 @@
           <w:numId w:val="1001"/>
         </w:numPr>
       </w:pPr>
-      <w:bookmarkStart w:id="88" w:name="ref-9"/>
+      <w:bookmarkStart w:id="89" w:name="ref-9"/>
       <w:r>
         <w:t xml:space="preserve">Haikala V, et al. (2013). Optogenetic control of fly optomotor responses.</w:t>
       </w:r>
@@ -13065,7 +13076,7 @@
       <w:r>
         <w:t xml:space="preserve"> </w:t>
       </w:r>
-      <w:hyperlink r:id="rId87">
+      <w:hyperlink r:id="rId88">
         <w:r>
           <w:rPr>
             <w:rStyle w:val="Hyperlink"/>
@@ -13073,7 +13084,7 @@
           <w:t xml:space="preserve">PMC6618655</w:t>
         </w:r>
       </w:hyperlink>
-      <w:bookmarkEnd w:id="88"/>
+      <w:bookmarkEnd w:id="89"/>
     </w:p>
     <w:p>
       <w:pPr>
@@ -13083,7 +13094,7 @@
           <w:numId w:val="1001"/>
         </w:numPr>
       </w:pPr>
-      <w:bookmarkStart w:id="90" w:name="ref-10"/>
+      <w:bookmarkStart w:id="91" w:name="ref-10"/>
       <w:r>
         <w:t xml:space="preserve">Namiki S, et al. (2018). The functional organization of descending sensory-motor pathways in</w:t>
       </w:r>
@@ -13119,7 +13130,7 @@
       <w:r>
         <w:t xml:space="preserve"> </w:t>
       </w:r>
-      <w:hyperlink r:id="rId89">
+      <w:hyperlink r:id="rId90">
         <w:r>
           <w:rPr>
             <w:rStyle w:val="Hyperlink"/>
@@ -13127,7 +13138,7 @@
           <w:t xml:space="preserve">PMC6019073</w:t>
         </w:r>
       </w:hyperlink>
-      <w:bookmarkEnd w:id="90"/>
+      <w:bookmarkEnd w:id="91"/>
     </w:p>
     <w:p>
       <w:pPr>
@@ -13137,7 +13148,7 @@
           <w:numId w:val="1001"/>
         </w:numPr>
       </w:pPr>
-      <w:bookmarkStart w:id="92" w:name="ref-11"/>
+      <w:bookmarkStart w:id="93" w:name="ref-11"/>
       <w:r>
         <w:t xml:space="preserve">Rayshubskiy A, et al. (2025). Neural circuit mechanisms for steering control in walking</w:t>
       </w:r>
@@ -13173,7 +13184,7 @@
       <w:r>
         <w:t xml:space="preserve"> </w:t>
       </w:r>
-      <w:hyperlink r:id="rId91">
+      <w:hyperlink r:id="rId92">
         <w:r>
           <w:rPr>
             <w:rStyle w:val="Hyperlink"/>
@@ -13181,7 +13192,7 @@
           <w:t xml:space="preserve">doi:10.7554/eLife.102230</w:t>
         </w:r>
       </w:hyperlink>
-      <w:bookmarkEnd w:id="92"/>
+      <w:bookmarkEnd w:id="93"/>
     </w:p>
     <w:p>
       <w:pPr>
@@ -13191,7 +13202,7 @@
           <w:numId w:val="1001"/>
         </w:numPr>
       </w:pPr>
-      <w:bookmarkStart w:id="94" w:name="ref-12"/>
+      <w:bookmarkStart w:id="95" w:name="ref-12"/>
       <w:r>
         <w:t xml:space="preserve">Theobald JC, Ringach DL, Frye MA (2010). Dynamics of optomotor responses in</w:t>
       </w:r>
@@ -13230,7 +13241,7 @@
       <w:r>
         <w:t xml:space="preserve"> </w:t>
       </w:r>
-      <w:hyperlink r:id="rId93">
+      <w:hyperlink r:id="rId94">
         <w:r>
           <w:rPr>
             <w:rStyle w:val="Hyperlink"/>
@@ -13238,7 +13249,7 @@
           <w:t xml:space="preserve">PMC2846167</w:t>
         </w:r>
       </w:hyperlink>
-      <w:bookmarkEnd w:id="94"/>
+      <w:bookmarkEnd w:id="95"/>
     </w:p>
     <w:p>
       <w:pPr>
@@ -13248,14 +13259,14 @@
           <w:numId w:val="1001"/>
         </w:numPr>
       </w:pPr>
-      <w:bookmarkStart w:id="96" w:name="ref-13"/>
+      <w:bookmarkStart w:id="97" w:name="ref-13"/>
       <w:r>
         <w:t xml:space="preserve">ClutchMedia775 (2026). fly-brain-drone. Software repository, commit d017a6c, accessed 3 Oct 2026.</w:t>
       </w:r>
       <w:r>
         <w:t xml:space="preserve"> </w:t>
       </w:r>
-      <w:hyperlink r:id="rId95">
+      <w:hyperlink r:id="rId96">
         <w:r>
           <w:rPr>
             <w:rStyle w:val="Hyperlink"/>
@@ -13263,7 +13274,7 @@
           <w:t xml:space="preserve">github.com/ClutchMedia775/fly-brain-drone</w:t>
         </w:r>
       </w:hyperlink>
-      <w:bookmarkEnd w:id="96"/>
+      <w:bookmarkEnd w:id="97"/>
     </w:p>
     <w:p>
       <w:pPr>
@@ -13273,14 +13284,14 @@
           <w:numId w:val="1001"/>
         </w:numPr>
       </w:pPr>
-      <w:bookmarkStart w:id="98" w:name="ref-14"/>
+      <w:bookmarkStart w:id="99" w:name="ref-14"/>
       <w:r>
         <w:t xml:space="preserve">leohio (2026). connectome-fly-closedloop. Software repository, commit 56eae22.</w:t>
       </w:r>
       <w:r>
         <w:t xml:space="preserve"> </w:t>
       </w:r>
-      <w:hyperlink r:id="rId97">
+      <w:hyperlink r:id="rId98">
         <w:r>
           <w:rPr>
             <w:rStyle w:val="Hyperlink"/>
@@ -13288,7 +13299,7 @@
           <w:t xml:space="preserve">github.com/leohio/connectome-fly-closedloop</w:t>
         </w:r>
       </w:hyperlink>
-      <w:bookmarkEnd w:id="98"/>
+      <w:bookmarkEnd w:id="99"/>
     </w:p>
     <w:p>
       <w:pPr>
@@ -13298,14 +13309,14 @@
           <w:numId w:val="1001"/>
         </w:numPr>
       </w:pPr>
-      <w:bookmarkStart w:id="100" w:name="ref-15"/>
+      <w:bookmarkStart w:id="101" w:name="ref-15"/>
       <w:r>
         <w:t xml:space="preserve">Jin Z, Zhu Y, Zhang C, Sui Y (2026). Whole-brain connectomic graph model enables whole-body locomotion control in fruit fly (FlyGM). arXiv:2602.17997v3 (14 Jun 2026).</w:t>
       </w:r>
       <w:r>
         <w:t xml:space="preserve"> </w:t>
       </w:r>
-      <w:hyperlink r:id="rId99">
+      <w:hyperlink r:id="rId100">
         <w:r>
           <w:rPr>
             <w:rStyle w:val="Hyperlink"/>
@@ -13313,7 +13324,7 @@
           <w:t xml:space="preserve">arxiv.org/abs/2602.17997v3</w:t>
         </w:r>
       </w:hyperlink>
-      <w:bookmarkEnd w:id="100"/>
+      <w:bookmarkEnd w:id="101"/>
     </w:p>
     <w:p>
       <w:pPr>
@@ -13323,7 +13334,7 @@
           <w:numId w:val="1001"/>
         </w:numPr>
       </w:pPr>
-      <w:bookmarkStart w:id="102" w:name="ref-16"/>
+      <w:bookmarkStart w:id="103" w:name="ref-16"/>
       <w:r>
         <w:t xml:space="preserve">Leibbrandt R, Nicholas S, Nordström K (2021). The impulse response of optic flow-sensitive descending neurons to roll m-sequences.</w:t>
       </w:r>
@@ -13346,7 +13357,7 @@
       <w:r>
         <w:t xml:space="preserve"> </w:t>
       </w:r>
-      <w:hyperlink r:id="rId101">
+      <w:hyperlink r:id="rId102">
         <w:r>
           <w:rPr>
             <w:rStyle w:val="Hyperlink"/>
@@ -13354,7 +13365,7 @@
           <w:t xml:space="preserve">doi:10.1242/jeb.242833</w:t>
         </w:r>
       </w:hyperlink>
-      <w:bookmarkEnd w:id="102"/>
+      <w:bookmarkEnd w:id="103"/>
     </w:p>
     <w:p>
       <w:pPr>
@@ -13364,14 +13375,14 @@
           <w:numId w:val="1001"/>
         </w:numPr>
       </w:pPr>
-      <w:bookmarkStart w:id="105" w:name="ref-17"/>
+      <w:bookmarkStart w:id="106" w:name="ref-17"/>
       <w:r>
         <w:t xml:space="preserve">Berndt JS, Coconnier B, De Marco A, McLeod S (2026). JSBSim – An Open Source Flight Dynamics Software Library, v1.3.1. Software.</w:t>
       </w:r>
       <w:r>
         <w:t xml:space="preserve"> </w:t>
       </w:r>
-      <w:hyperlink r:id="rId103">
+      <w:hyperlink r:id="rId104">
         <w:r>
           <w:rPr>
             <w:rStyle w:val="Hyperlink"/>
@@ -13385,7 +13396,7 @@
       <w:r>
         <w:t xml:space="preserve"> </w:t>
       </w:r>
-      <w:hyperlink r:id="rId104">
+      <w:hyperlink r:id="rId105">
         <w:r>
           <w:rPr>
             <w:rStyle w:val="Hyperlink"/>
@@ -13393,7 +13404,7 @@
           <w:t xml:space="preserve">github.com/JSBSim-Team/jsbsim</w:t>
         </w:r>
       </w:hyperlink>
-      <w:bookmarkEnd w:id="105"/>
+      <w:bookmarkEnd w:id="106"/>
     </w:p>
     <w:p>
       <w:pPr>
@@ -13403,14 +13414,14 @@
           <w:numId w:val="1001"/>
         </w:numPr>
       </w:pPr>
-      <w:bookmarkStart w:id="107" w:name="ref-18"/>
+      <w:bookmarkStart w:id="108" w:name="ref-18"/>
       <w:r>
         <w:t xml:space="preserve">Yeager JC (1998). Implementation and testing of turbulence models for the F18-HARV simulation. NASA/CR-1998-206937.</w:t>
       </w:r>
       <w:r>
         <w:t xml:space="preserve"> </w:t>
       </w:r>
-      <w:hyperlink r:id="rId106">
+      <w:hyperlink r:id="rId107">
         <w:r>
           <w:rPr>
             <w:rStyle w:val="Hyperlink"/>
@@ -13418,7 +13429,7 @@
           <w:t xml:space="preserve">ntrs.nasa.gov/citations/19980028448</w:t>
         </w:r>
       </w:hyperlink>
-      <w:bookmarkEnd w:id="107"/>
+      <w:bookmarkEnd w:id="108"/>
     </w:p>
     <w:p>
       <w:pPr>
@@ -13428,7 +13439,7 @@
           <w:numId w:val="1001"/>
         </w:numPr>
       </w:pPr>
-      <w:bookmarkStart w:id="109" w:name="ref-19"/>
+      <w:bookmarkStart w:id="110" w:name="ref-19"/>
       <w:r>
         <w:t xml:space="preserve">Boeing Co. (1975).</w:t>
       </w:r>
@@ -13448,7 +13459,7 @@
       <w:r>
         <w:t xml:space="preserve"> </w:t>
       </w:r>
-      <w:hyperlink r:id="rId108">
+      <w:hyperlink r:id="rId109">
         <w:r>
           <w:rPr>
             <w:rStyle w:val="Hyperlink"/>
@@ -13456,7 +13467,7 @@
           <w:t xml:space="preserve">acgsc.org</w:t>
         </w:r>
       </w:hyperlink>
-      <w:bookmarkEnd w:id="109"/>
+      <w:bookmarkEnd w:id="110"/>
     </w:p>
     <w:p>
       <w:pPr>
@@ -13466,7 +13477,7 @@
           <w:numId w:val="1001"/>
         </w:numPr>
       </w:pPr>
-      <w:bookmarkStart w:id="111" w:name="ref-20"/>
+      <w:bookmarkStart w:id="112" w:name="ref-20"/>
       <w:r>
         <w:t xml:space="preserve">Mansur MH, Lusardi JA, Tischler MB, Berger T (2009). Achieving the best compromise between stability margins and disturbance rejection performance.</w:t>
       </w:r>
@@ -13486,7 +13497,7 @@
       <w:r>
         <w:t xml:space="preserve"> </w:t>
       </w:r>
-      <w:hyperlink r:id="rId110">
+      <w:hyperlink r:id="rId111">
         <w:r>
           <w:rPr>
             <w:rStyle w:val="Hyperlink"/>
@@ -13494,7 +13505,7 @@
           <w:t xml:space="preserve">sjsu.edu/researchfoundation/docs/AHS_2009_Mansur.pdf</w:t>
         </w:r>
       </w:hyperlink>
-      <w:bookmarkEnd w:id="111"/>
+      <w:bookmarkEnd w:id="112"/>
     </w:p>
     <w:p>
       <w:pPr>
@@ -13504,7 +13515,7 @@
           <w:numId w:val="1001"/>
         </w:numPr>
       </w:pPr>
-      <w:bookmarkStart w:id="113" w:name="ref-21"/>
+      <w:bookmarkStart w:id="114" w:name="ref-21"/>
       <w:r>
         <w:t xml:space="preserve">Phipson B, Smyth GK (2010). Permutation P-values should never be zero: calculating exact P-values when permutations are randomly drawn.</w:t>
       </w:r>
@@ -13527,7 +13538,7 @@
       <w:r>
         <w:t xml:space="preserve"> </w:t>
       </w:r>
-      <w:hyperlink r:id="rId112">
+      <w:hyperlink r:id="rId113">
         <w:r>
           <w:rPr>
             <w:rStyle w:val="Hyperlink"/>
@@ -13535,7 +13546,7 @@
           <w:t xml:space="preserve">doi:10.2202/1544-6115.1585</w:t>
         </w:r>
       </w:hyperlink>
-      <w:bookmarkEnd w:id="113"/>
+      <w:bookmarkEnd w:id="114"/>
     </w:p>
     <w:p>
       <w:pPr>
@@ -13545,7 +13556,7 @@
           <w:numId w:val="1001"/>
         </w:numPr>
       </w:pPr>
-      <w:bookmarkStart w:id="115" w:name="ref-22"/>
+      <w:bookmarkStart w:id="116" w:name="ref-22"/>
       <w:r>
         <w:t xml:space="preserve">Pokusaeva VO, Satapathy R, Symonova O, Joesch M (2024). Bilateral interactions of optic-flow sensitive neurons coordinate course control in flies.</w:t>
       </w:r>
@@ -13568,7 +13579,7 @@
       <w:r>
         <w:t xml:space="preserve"> </w:t>
       </w:r>
-      <w:hyperlink r:id="rId114">
+      <w:hyperlink r:id="rId115">
         <w:r>
           <w:rPr>
             <w:rStyle w:val="Hyperlink"/>
@@ -13576,10 +13587,10 @@
           <w:t xml:space="preserve">doi:10.1038/s41467-024-53173-w</w:t>
         </w:r>
       </w:hyperlink>
-      <w:bookmarkEnd w:id="115"/>
-    </w:p>
-    <w:bookmarkEnd w:id="116"/>
+      <w:bookmarkEnd w:id="116"/>
+    </w:p>
     <w:bookmarkEnd w:id="117"/>
+    <w:bookmarkEnd w:id="118"/>
     <w:sectPr>
       <w:footnotePr>
         <w:numRestart w:val="eachSect"/>

</xml_diff>

<commit_message>
Add contact email and detailed AI-use statement to paper
</commit_message>
<xml_diff>
--- a/paper/paper.docx
+++ b/paper/paper.docx
@@ -23,7 +23,7 @@
         <w:pStyle w:val="Author"/>
       </w:pPr>
       <w:r>
-        <w:t xml:space="preserve">Mutaqin Aryawijaya, Independent researcher</w:t>
+        <w:t xml:space="preserve">Mutaqin Aryawijaya, Independent researcher (mutaqin@aryawijaya.com)</w:t>
       </w:r>
     </w:p>
     <w:p>
@@ -12623,7 +12623,7 @@
         <w:pStyle w:val="FirstParagraph"/>
       </w:pPr>
       <w:r>
-        <w:t xml:space="preserve">AI tools (Anthropic Claude) assisted with code, analysis, reviews and drafting. The author directed the study, made the design decisions and checked the results.</w:t>
+        <w:t xml:space="preserve">Generative AI: Claude Opus 5.5 (Anthropic), used through Claude Code, assisted with writing and reviewing the simulation and analysis code, running and checking the analyses, checking the literature and citations, building the web viewer, and drafting and editing the text. The author designed the study, made the methodological decisions, checked the results and the text, and takes full responsibility for the content.</w:t>
       </w:r>
     </w:p>
     <w:bookmarkEnd w:id="69"/>

</xml_diff>

<commit_message>
State AI-tool use in Methods
</commit_message>
<xml_diff>
--- a/paper/paper.docx
+++ b/paper/paper.docx
@@ -8568,6 +8568,24 @@
       </w:r>
       <w:r>
         <w:t xml:space="preserve"> + 1; because its random-number generator is implementation-defined, all reported six-degree-of-freedom flights were run on Linux. The experiments were sharded across free GitHub Actions runners; each analysis step re-derives its numbers from the per-job outputs and ends with an assertion-based self-check, and every result number in this paper is read from a generated summary file that records the source of each value (protocol constants appear in the prose).</w:t>
+      </w:r>
+    </w:p>
+    <w:p>
+      <w:pPr>
+        <w:pStyle w:val="BodyText"/>
+      </w:pPr>
+      <w:r>
+        <w:rPr>
+          <w:i/>
+          <w:iCs/>
+        </w:rPr>
+        <w:t xml:space="preserve">Use of AI tools.</w:t>
+      </w:r>
+      <w:r>
+        <w:t xml:space="preserve"> </w:t>
+      </w:r>
+      <w:r>
+        <w:t xml:space="preserve">Claude Opus 5.5 (Anthropic), used through Claude Code, assisted with writing and reviewing the simulation and analysis code, running and checking the analyses, checking the literature and citations, building the web viewer, and drafting and editing the text. The author designed the study, made the methodological decisions, and checked the results and the final text.</w:t>
       </w:r>
     </w:p>
     <w:bookmarkEnd w:id="21"/>

</xml_diff>